<commit_message>
Fix agreement document encoding
</commit_message>
<xml_diff>
--- a/backend/doc/Пользовательское соглашение.docx
+++ b/backend/doc/Пользовательское соглашение.docx
@@ -13,7 +13,18 @@
           <w:b/>
           <w:sz w:val="30"/>
         </w:rPr>
-        <w:t>???????????????? ??????????</w:t>
+        <w:t>Пользовательское соглашение</w:t>
+      </w:r>
+      <w:r>
+        <w:br/>
+      </w:r>
+      <w:r>
+        <w:rPr>
+          <w:rFonts w:ascii="Times New Roman" w:hAnsi="Times New Roman" w:eastAsia="Times New Roman"/>
+          <w:b/>
+          <w:sz w:val="30"/>
+        </w:rPr>
+        <w:t>об использовании сайта и информационной системы ресторана «СВОЙ ресторан»</w:t>
       </w:r>
     </w:p>
     <w:p>
@@ -26,7 +37,18 @@
           <w:b w:val="0"/>
           <w:sz w:val="24"/>
         </w:rPr>
-        <w:t>?? ????????????? ????? ? ?????????????? ??????? ????????? ????? ?????????</w:t>
+        <w:t>Российская Федерация, г. Калининград</w:t>
+      </w:r>
+      <w:r>
+        <w:br/>
+      </w:r>
+      <w:r>
+        <w:rPr>
+          <w:rFonts w:ascii="Times New Roman" w:hAnsi="Times New Roman" w:eastAsia="Times New Roman"/>
+          <w:b w:val="0"/>
+          <w:sz w:val="24"/>
+        </w:rPr>
+        <w:t>8 апреля 2026 года</w:t>
       </w:r>
     </w:p>
     <w:p>
@@ -39,461 +61,436 @@
           <w:b w:val="0"/>
           <w:sz w:val="24"/>
         </w:rPr>
-        <w:t>?????????? ?????????, ?. ???????????</w:t>
-        <w:br/>
-        <w:t>8 ?????? 2026 ????</w:t>
-      </w:r>
-    </w:p>
-    <w:p>
-      <w:pPr>
-        <w:pStyle w:val="1"/>
-      </w:pPr>
-      <w:r>
-        <w:rPr>
-          <w:rFonts w:ascii="Times New Roman" w:hAnsi="Times New Roman" w:eastAsia="Times New Roman"/>
-          <w:b/>
-          <w:sz w:val="26"/>
-        </w:rPr>
-        <w:t>1. ??????? ? ???????????</w:t>
-      </w:r>
-    </w:p>
-    <w:p>
-      <w:pPr/>
-      <w:r>
-        <w:rPr>
-          <w:rFonts w:ascii="Times New Roman" w:hAnsi="Times New Roman" w:eastAsia="Times New Roman"/>
-          <w:b w:val="0"/>
-          <w:sz w:val="24"/>
-        </w:rPr>
-        <w:t>1.1. ???????? (????????) ? ??? ????? ?????????, ??????????? ?????: ?. ???????????, ??. ?????????????, 6?, ?????????? ?????????? ????? ? ?????????????? ??????? ?????????.</w:t>
-      </w:r>
-    </w:p>
-    <w:p>
-      <w:pPr/>
-      <w:r>
-        <w:rPr>
-          <w:rFonts w:ascii="Times New Roman" w:hAnsi="Times New Roman" w:eastAsia="Times New Roman"/>
-          <w:b w:val="0"/>
-          <w:sz w:val="24"/>
-        </w:rPr>
-        <w:t>1.2. ????/??????? ? ??????????? ???????? ????????? ????? ?????????, ?????????? ????????? ????, ?????? ??????? ????????????, ?????????? ???????????? ? ??????, ????? ?????????? ????????, ???????? ?????????? ? ?????????? ?????-?????? ??? ????????????? ?????????? ??????????.</w:t>
-      </w:r>
-    </w:p>
-    <w:p>
-      <w:pPr/>
-      <w:r>
-        <w:rPr>
-          <w:rFonts w:ascii="Times New Roman" w:hAnsi="Times New Roman" w:eastAsia="Times New Roman"/>
-          <w:b w:val="0"/>
-          <w:sz w:val="24"/>
-        </w:rPr>
-        <w:t>1.3. ???????????? ? ?????????? ????, ???????????? ????/??????? ??? ????????? ???? ? ?????, ??????????? ????????, ???????????? ??????, ?????????? ???????, ???????????? ??????? ??????? ? ????????????? ???? ???????????????? ??????? ???????.</w:t>
-      </w:r>
-    </w:p>
-    <w:p>
-      <w:pPr/>
-      <w:r>
-        <w:rPr>
-          <w:rFonts w:ascii="Times New Roman" w:hAnsi="Times New Roman" w:eastAsia="Times New Roman"/>
-          <w:b w:val="0"/>
-          <w:sz w:val="24"/>
-        </w:rPr>
-        <w:t>1.4. ??????? ?????? (???????) ? ???????????? ?????? ???????????? ? ???????, ?????????? ?????????? ?????????????, ???, ????? ????????, ?????? ? ???? ????, ??????? ???????????? ? ???????, ???????? ?????? ? ???????????? ? ?????????? ??????? ??????, ???? ??? ???????? ? ??????? ?????? ???????.</w:t>
-      </w:r>
-    </w:p>
-    <w:p>
-      <w:pPr/>
-      <w:r>
-        <w:rPr>
-          <w:rFonts w:ascii="Times New Roman" w:hAnsi="Times New Roman" w:eastAsia="Times New Roman"/>
-          <w:b w:val="0"/>
-          <w:sz w:val="24"/>
-        </w:rPr>
-        <w:t>1.5. ?????-?????? ? ?????????? ????????? ??????? ?? ?????? `/admin`, ??????????????? ??? ????????? ???????, ????????????, ????????, ???????? ????????, ???????? ???? ? ?????-??????????.</w:t>
-      </w:r>
-    </w:p>
-    <w:p>
-      <w:pPr/>
-      <w:r>
-        <w:rPr>
-          <w:rFonts w:ascii="Times New Roman" w:hAnsi="Times New Roman" w:eastAsia="Times New Roman"/>
-          <w:b w:val="0"/>
-          <w:sz w:val="24"/>
-        </w:rPr>
-        <w:t>1.6. ?????????????/???????? ? ?????????????? ????????? ?????????, ??? ??????? ?????? ???????? ? ?????-??????. ? ??????? ?????? ??????? ???????????? ?????? ?????????? ??????? ?????????? ??????? ??? ?????????? ?? ????????? ????????????? ???? ? ?????? ??????????.</w:t>
-      </w:r>
-    </w:p>
-    <w:p>
-      <w:pPr/>
-      <w:r>
-        <w:rPr>
-          <w:rFonts w:ascii="Times New Roman" w:hAnsi="Times New Roman" w:eastAsia="Times New Roman"/>
-          <w:b w:val="0"/>
-          <w:sz w:val="24"/>
-        </w:rPr>
-        <w:t>1.7. ???????????? ? ??????????? ????? ??????? ?????? ? ?????????????? ??????? ?? ????????? ???? ? ?????.</w:t>
-      </w:r>
-    </w:p>
-    <w:p>
-      <w:pPr/>
-      <w:r>
-        <w:rPr>
-          <w:rFonts w:ascii="Times New Roman" w:hAnsi="Times New Roman" w:eastAsia="Times New Roman"/>
-          <w:b w:val="0"/>
-          <w:sz w:val="24"/>
-        </w:rPr>
-        <w:t>1.8. ????? ? ??????????? ????? ??????? ????? ???? ? ???? ????????? ??? ?? ????????.</w:t>
-      </w:r>
-    </w:p>
-    <w:p>
-      <w:pPr/>
-      <w:r>
-        <w:rPr>
-          <w:rFonts w:ascii="Times New Roman" w:hAnsi="Times New Roman" w:eastAsia="Times New Roman"/>
-          <w:b w:val="0"/>
-          <w:sz w:val="24"/>
-        </w:rPr>
-        <w:t>1.9. ????-?????? ?????? ? ??????? ?????? ??????, ????????? ? ?????????? ??????? ????????????? ??? ???????????? ????????????????? ???????? ??? ????? ? ???????? ???????? ????????? ?????????? ?????????? ?????.</w:t>
-      </w:r>
-    </w:p>
-    <w:p>
-      <w:pPr/>
-      <w:r>
-        <w:rPr>
-          <w:rFonts w:ascii="Times New Roman" w:hAnsi="Times New Roman" w:eastAsia="Times New Roman"/>
-          <w:b w:val="0"/>
-          <w:sz w:val="24"/>
-        </w:rPr>
-        <w:t>1.10. ???????????? ?????? ? ??????????, ??????????? ? ???????????? ????? ??? ????????, ??????? ???, ????? ????????, ?????? ??????? ??????, ??????? ????????????, ???????, ???????? ???????? ? ???? ????????, ?????????? ????? ????? ???????.</w:t>
-      </w:r>
-    </w:p>
-    <w:p>
-      <w:pPr>
-        <w:pStyle w:val="1"/>
-      </w:pPr>
-      <w:r>
-        <w:rPr>
-          <w:rFonts w:ascii="Times New Roman" w:hAnsi="Times New Roman" w:eastAsia="Times New Roman"/>
-          <w:b/>
-          <w:sz w:val="26"/>
-        </w:rPr>
-        <w:t>2. ????? ?????????</w:t>
-      </w:r>
-    </w:p>
-    <w:p>
-      <w:pPr/>
-      <w:r>
-        <w:rPr>
-          <w:rFonts w:ascii="Times New Roman" w:hAnsi="Times New Roman" w:eastAsia="Times New Roman"/>
-          <w:b w:val="0"/>
-          <w:sz w:val="24"/>
-        </w:rPr>
-        <w:t>2.1. ????????? ?????????? ?????????? ????????????? ?????/??????? ????????? ????? ????????? ? ??????????? ?? ???? ?????????????, ???????????? ????????? ? ?????????????? ??????? ???????.</w:t>
-      </w:r>
-    </w:p>
-    <w:p>
-      <w:pPr/>
-      <w:r>
-        <w:rPr>
-          <w:rFonts w:ascii="Times New Roman" w:hAnsi="Times New Roman" w:eastAsia="Times New Roman"/>
-          <w:b w:val="0"/>
-          <w:sz w:val="24"/>
-        </w:rPr>
-        <w:t>2.2. ??????????? ????????, ???? ? ?????? ???????, ???????? ????????????, ?????????? ?????? ???? ?????????? ????????????? ?????/??????? ???????? ?????? ? ?????????????? ???????? ??????? ?????????? ?????????? ? ???????? ? ??????????? ????????? ????????? ???????????? ??????.</w:t>
-      </w:r>
-    </w:p>
-    <w:p>
-      <w:pPr/>
-      <w:r>
-        <w:rPr>
-          <w:rFonts w:ascii="Times New Roman" w:hAnsi="Times New Roman" w:eastAsia="Times New Roman"/>
-          <w:b w:val="0"/>
-          <w:sz w:val="24"/>
-        </w:rPr>
-        <w:t>2.3. ???????? ?????? ???????? ????????? ?????????? ? ????? ?????. ????? ???????? ??????????? ? ??????? ?? ?????????? ?? ?????, ???? ???? ?? ??????? ?????????????.</w:t>
-      </w:r>
-    </w:p>
-    <w:p>
-      <w:pPr/>
-      <w:r>
-        <w:rPr>
-          <w:rFonts w:ascii="Times New Roman" w:hAnsi="Times New Roman" w:eastAsia="Times New Roman"/>
-          <w:b w:val="0"/>
-          <w:sz w:val="24"/>
-        </w:rPr>
-        <w:t>2.4. ??? ????????? ???????????? ?????? ???????? ??????????????? ??????????? ????????????????? ?????????? ?????????, ??????? ??????????? ????? ? 152-?? ?? ???????????? ???????.</w:t>
-      </w:r>
-    </w:p>
-    <w:p>
-      <w:pPr>
-        <w:pStyle w:val="1"/>
-      </w:pPr>
-      <w:r>
-        <w:rPr>
-          <w:rFonts w:ascii="Times New Roman" w:hAnsi="Times New Roman" w:eastAsia="Times New Roman"/>
-          <w:b/>
-          <w:sz w:val="26"/>
-        </w:rPr>
-        <w:t>3. ?????? ? ??????? ? ??????? ?????????????</w:t>
-      </w:r>
-    </w:p>
-    <w:p>
-      <w:pPr/>
-      <w:r>
-        <w:rPr>
-          <w:rFonts w:ascii="Times New Roman" w:hAnsi="Times New Roman" w:eastAsia="Times New Roman"/>
-          <w:b w:val="0"/>
-          <w:sz w:val="24"/>
-        </w:rPr>
-        <w:t>3.1. ??? ??????????? ???????????? ????? ????????????? ????????? ??????? ?????, ??????? ??????? ????????, ????, ?????, ?????????? ? ???????? ? ???? ???????? ????????? ???????.</w:t>
-      </w:r>
-    </w:p>
-    <w:p>
-      <w:pPr/>
-      <w:r>
-        <w:rPr>
-          <w:rFonts w:ascii="Times New Roman" w:hAnsi="Times New Roman" w:eastAsia="Times New Roman"/>
-          <w:b w:val="0"/>
-          <w:sz w:val="24"/>
-        </w:rPr>
-        <w:t>3.2. ??? ??????? ? ??????? ????????, ??????? ???????, ????????? ???????, ????????????? ? ????????? ???????? ?????? ???????????? ??????? ??????? ? ????????? ?????, ?????? ???????? ? ??????.</w:t>
-      </w:r>
-    </w:p>
-    <w:p>
-      <w:pPr/>
-      <w:r>
-        <w:rPr>
-          <w:rFonts w:ascii="Times New Roman" w:hAnsi="Times New Roman" w:eastAsia="Times New Roman"/>
-          <w:b w:val="0"/>
-          <w:sz w:val="24"/>
-        </w:rPr>
-        <w:t>3.3. ???????????? ?????? ???????????? ?????????????????? ????? ??????? ?????? ? ??????????????? ?????????? ????????????? ??????????????????? ??????? ?????? ???? ?????????? ? ???????? ??? ?????????? ?? ??????????????????? ??????.</w:t>
-      </w:r>
-    </w:p>
-    <w:p>
-      <w:pPr/>
-      <w:r>
-        <w:rPr>
-          <w:rFonts w:ascii="Times New Roman" w:hAnsi="Times New Roman" w:eastAsia="Times New Roman"/>
-          <w:b w:val="0"/>
-          <w:sz w:val="24"/>
-        </w:rPr>
-        <w:t>3.4. ?????? ? ?????????? ???????? ?????????? ???????? ??????????????? ?????? ?????????????? ??????????? ????????? ????? ??????? ?????? ??????????????/?????????.</w:t>
-      </w:r>
-    </w:p>
-    <w:p>
-      <w:pPr/>
-      <w:r>
-        <w:rPr>
-          <w:rFonts w:ascii="Times New Roman" w:hAnsi="Times New Roman" w:eastAsia="Times New Roman"/>
-          <w:b w:val="0"/>
-          <w:sz w:val="24"/>
-        </w:rPr>
-        <w:t>3.5. ??????? ?? ??????????????? ??????????????? ????????????? ?????????? ????? ???? ??????????, ????????? ?????????????, ????????-????????? ??? ???? ??????? ??????????. ??? ????????? ???????? ? backoffice ??????????? ????? ?????? ??? ??????? ?????? ??????????????/????????? ? ???????? ?????, ???????????? ?????????.</w:t>
-      </w:r>
-    </w:p>
-    <w:p>
-      <w:pPr/>
-      <w:r>
-        <w:rPr>
-          <w:rFonts w:ascii="Times New Roman" w:hAnsi="Times New Roman" w:eastAsia="Times New Roman"/>
-          <w:b w:val="0"/>
-          <w:sz w:val="24"/>
-        </w:rPr>
-        <w:t>3.6. ?????????????/???????? ?????? ???????????? ????????????, ?????? ? ????????, ?????????????? ???????? ??????, ????????? ?????????? ???? ? ?????-????????, ? ????? ????????? ???? ???????????? ????????, ????? ?????????????? ??????????? ?????-??????.</w:t>
-      </w:r>
-    </w:p>
-    <w:p>
-      <w:pPr>
-        <w:pStyle w:val="1"/>
-      </w:pPr>
-      <w:r>
-        <w:rPr>
-          <w:rFonts w:ascii="Times New Roman" w:hAnsi="Times New Roman" w:eastAsia="Times New Roman"/>
-          <w:b/>
-          <w:sz w:val="26"/>
-        </w:rPr>
-        <w:t>4. ????????? ?????? ? ????????? ????????</w:t>
-      </w:r>
-    </w:p>
-    <w:p>
-      <w:pPr/>
-      <w:r>
-        <w:rPr>
-          <w:rFonts w:ascii="Times New Roman" w:hAnsi="Times New Roman" w:eastAsia="Times New Roman"/>
-          <w:b w:val="0"/>
-          <w:sz w:val="24"/>
-        </w:rPr>
-        <w:t>4.1. ???????? ????? ???????????? ????????? ???????? ? ????????????: ???, ????? ????????, ?????? ? ???? ????, ??????? ????????????, ??????? ???????, ???????? ??????, ??????????? ???????, ????????? ? ?????????????? ???????, ? ???? ??????, ???? ????????? ????????????? ? ?????? ?????.</w:t>
-      </w:r>
-    </w:p>
-    <w:p>
-      <w:pPr/>
-      <w:r>
-        <w:rPr>
-          <w:rFonts w:ascii="Times New Roman" w:hAnsi="Times New Roman" w:eastAsia="Times New Roman"/>
-          <w:b w:val="0"/>
-          <w:sz w:val="24"/>
-        </w:rPr>
-        <w:t>4.2. ?????? ????????????? ?? ???????? ? ???????? ???? ? ??????????? ? ???? ?????????????????? ????.</w:t>
-      </w:r>
-    </w:p>
-    <w:p>
-      <w:pPr/>
-      <w:r>
-        <w:rPr>
-          <w:rFonts w:ascii="Times New Roman" w:hAnsi="Times New Roman" w:eastAsia="Times New Roman"/>
-          <w:b w:val="0"/>
-          <w:sz w:val="24"/>
-        </w:rPr>
-        <w:t>4.3. ???????????? ????????? ????????????? ??????????? ??????. ???????? ?? ????? ??????????????? ?? ???????????, ????????? ??????????????? ???????? ??? ????????????? ??????????, ??????? ????????????? ??????????? ????????????, ????? ??? ???????? ????? ? ?????????????.</w:t>
-      </w:r>
-    </w:p>
-    <w:p>
-      <w:pPr/>
-      <w:r>
-        <w:rPr>
-          <w:rFonts w:ascii="Times New Roman" w:hAnsi="Times New Roman" w:eastAsia="Times New Roman"/>
-          <w:b w:val="0"/>
-          <w:sz w:val="24"/>
-        </w:rPr>
-        <w:t>4.4. ??????? ?????? ??????? ?????????? ??????? ????-????? ??????. ???? ?? ???????????? ??? ??????, ????????? ??? ???????? ???????? ??????? ?????????? ????, CVV/CVC-????? ? ???? ?????? ????????? ??????????.</w:t>
-      </w:r>
-    </w:p>
-    <w:p>
-      <w:pPr/>
-      <w:r>
-        <w:rPr>
-          <w:rFonts w:ascii="Times New Roman" w:hAnsi="Times New Roman" w:eastAsia="Times New Roman"/>
-          <w:b w:val="0"/>
-          <w:sz w:val="24"/>
-        </w:rPr>
-        <w:t>4.5. ? ?????? ???????? ???????????? ????? ???? ???????? ?????? ????-??????? ??????, ??????? ???????????? ??????????? ???????. ??? ?????? ?????? ???????? ??????? ????? ??????? ??????????? ?????????? ????-??????? ??????, ??? ?????, ????????????? ????????? ?????? ??????? ? ????????? ????????? ?????, ??????????? ??? ??????????? ? ?????????? ? ??????? ????????.</w:t>
-      </w:r>
-    </w:p>
-    <w:p>
-      <w:pPr/>
-      <w:r>
-        <w:rPr>
-          <w:rFonts w:ascii="Times New Roman" w:hAnsi="Times New Roman" w:eastAsia="Times New Roman"/>
-          <w:b w:val="0"/>
-          <w:sz w:val="24"/>
-        </w:rPr>
-        <w:t>4.6. ???????? ?? ????????? ???????? ? ????????? ????-??????? ?????? ???????? ? ????????? ??????????. ???????????? ????? ????????? ???????????? ????-?????? ?????? ????? ????????? ???????, ???? ????? ??????? ???????? ? ??????? ?????? ???????.</w:t>
-      </w:r>
-    </w:p>
-    <w:p>
-      <w:pPr/>
-      <w:r>
-        <w:rPr>
-          <w:rFonts w:ascii="Times New Roman" w:hAnsi="Times New Roman" w:eastAsia="Times New Roman"/>
-          <w:b w:val="0"/>
-          <w:sz w:val="24"/>
-        </w:rPr>
-        <w:t>4.7. ??????? ??????? ?????? ??????? ?? ???????? ????????????????? ???????? ????????? ????????? ???? ? ?? ???????? ? ???????????? ??????????? PCI DSS. ???? ? ??????? ????? ????????? ??????? ????????? ?????????, ??????? ????????? ????????? ?????? ????? ???? ????????????? ???????? ? ???????????? ????????.</w:t>
-      </w:r>
-    </w:p>
-    <w:p>
-      <w:pPr>
-        <w:pStyle w:val="1"/>
-      </w:pPr>
-      <w:r>
-        <w:rPr>
-          <w:rFonts w:ascii="Times New Roman" w:hAnsi="Times New Roman" w:eastAsia="Times New Roman"/>
-          <w:b/>
-          <w:sz w:val="26"/>
-        </w:rPr>
-        <w:t>5. ??????????? ? ??????????????? ??????</w:t>
-      </w:r>
-    </w:p>
-    <w:p>
-      <w:pPr/>
-      <w:r>
-        <w:rPr>
-          <w:rFonts w:ascii="Times New Roman" w:hAnsi="Times New Roman" w:eastAsia="Times New Roman"/>
-          <w:b w:val="0"/>
-          <w:sz w:val="24"/>
-        </w:rPr>
-        <w:t>5.1. ???????? ????????? ????????? ???????? ?????? ??? ??????????? ????????????????? ?????/??????? ? ?????? ?????? ?? ???????????????????? ??????? ? ?????? ????????? ? ?????? ???????? ???????.</w:t>
-      </w:r>
-    </w:p>
-    <w:p>
-      <w:pPr/>
-      <w:r>
-        <w:rPr>
-          <w:rFonts w:ascii="Times New Roman" w:hAnsi="Times New Roman" w:eastAsia="Times New Roman"/>
-          <w:b w:val="0"/>
-          <w:sz w:val="24"/>
-        </w:rPr>
-        <w:t>5.2. ???????????? ????????? ?? ????????????? ??????? ???????????????????? ??????? ? ????? ????????? ? ??????, ?? ??????????? ? ?????? ?????/???????, ?? ???????????? ??????? ??? ??????????????? ???????????? ???????????? ??????????? ? ?? ????????? ????????, ?????????? ?????????? ????????????????.</w:t>
-      </w:r>
-    </w:p>
-    <w:p>
-      <w:pPr/>
-      <w:r>
-        <w:rPr>
-          <w:rFonts w:ascii="Times New Roman" w:hAnsi="Times New Roman" w:eastAsia="Times New Roman"/>
-          <w:b w:val="0"/>
-          <w:sz w:val="24"/>
-        </w:rPr>
-        <w:t>5.3. ?????????????/???????? ?????? ???????????? ????????? ?????? ????????????? ? ??????? ?????, ?? ?????????? ??????? ?????? ??????? ????? ? ????????? ?????????????????? ??????????, ????????? ????? ?????-??????.</w:t>
-      </w:r>
-    </w:p>
-    <w:p>
-      <w:pPr/>
-      <w:r>
-        <w:rPr>
-          <w:rFonts w:ascii="Times New Roman" w:hAnsi="Times New Roman" w:eastAsia="Times New Roman"/>
-          <w:b w:val="0"/>
-          <w:sz w:val="24"/>
-        </w:rPr>
-        <w:t>5.4. ???????? ?? ????? ??????????????? ?? ??????? ? ?????? ?????/???????, ????????? ?????????? ??????? ???, ???????????? ??????, ????????????????? ????????, ?????????? ?????, ?????????????? ???? ???????????????? ????????????? ????.</w:t>
-      </w:r>
-    </w:p>
-    <w:p>
-      <w:pPr>
-        <w:pStyle w:val="1"/>
-      </w:pPr>
-      <w:r>
-        <w:rPr>
-          <w:rFonts w:ascii="Times New Roman" w:hAnsi="Times New Roman" w:eastAsia="Times New Roman"/>
-          <w:b/>
-          <w:sz w:val="26"/>
-        </w:rPr>
-        <w:t>6. ?????????????? ?????????</w:t>
-      </w:r>
-    </w:p>
-    <w:p>
-      <w:pPr/>
-      <w:r>
-        <w:rPr>
-          <w:rFonts w:ascii="Times New Roman" w:hAnsi="Times New Roman" w:eastAsia="Times New Roman"/>
-          <w:b w:val="0"/>
-          <w:sz w:val="24"/>
-        </w:rPr>
-        <w:t>6.1. ????????? ?????????? ???????? ? ???? ??? ???????????? ? ??????? ??????? ????????????? ?????/???????, ? ??? ??????????????/????????? ? ? ??????? ?????????????? ?????????? ??????? ? ?????-??????.</w:t>
-      </w:r>
-    </w:p>
-    <w:p>
-      <w:pPr/>
-      <w:r>
-        <w:rPr>
-          <w:rFonts w:ascii="Times New Roman" w:hAnsi="Times New Roman" w:eastAsia="Times New Roman"/>
-          <w:b w:val="0"/>
-          <w:sz w:val="24"/>
-        </w:rPr>
-        <w:t>6.2. ??? ????? ? ??????????? ???????? ?????????????? ????? ???????????, ? ??? ???????????? ???????? ? ? ???????? ??????? ?? ????? ?????????? ????????? ? ???????????? ? ????????????????? ?????????? ?????????.</w:t>
-      </w:r>
-    </w:p>
-    <w:p>
-      <w:pPr/>
-      <w:r>
-        <w:rPr>
-          <w:rFonts w:ascii="Times New Roman" w:hAnsi="Times New Roman" w:eastAsia="Times New Roman"/>
-          <w:b w:val="0"/>
-          <w:sz w:val="24"/>
-        </w:rPr>
-        <w:t>6.3. ?? ???????? ????????????? ?????/??????? ???????????? ????? ?????????? ? ???????? ?? ???????? +7 (670) 690-42-42 ??? ?? ??????????? ????? six-seven@yandex.ru.</w:t>
+        <w:t>1. Термины и определения</w:t>
+      </w:r>
+    </w:p>
+    <w:p>
+      <w:pPr/>
+      <w:r>
+        <w:rPr>
+          <w:rFonts w:ascii="Times New Roman" w:hAnsi="Times New Roman" w:eastAsia="Times New Roman"/>
+          <w:b w:val="0"/>
+          <w:sz w:val="24"/>
+        </w:rPr>
+        <w:t>1.1. Компания (ресторан) — ООО «СВОЙ ресторан», юридический адрес: г. Калининград, ул. Черняховского, 6А, являющееся владельцем сайта и информационной системы ресторана.</w:t>
+      </w:r>
+    </w:p>
+    <w:p>
+      <w:pPr/>
+      <w:r>
+        <w:rPr>
+          <w:rFonts w:ascii="Times New Roman" w:hAnsi="Times New Roman" w:eastAsia="Times New Roman"/>
+          <w:b w:val="0"/>
+          <w:sz w:val="24"/>
+        </w:rPr>
+        <w:t>1.2. Сайт/Система — программный комплекс ресторана «СВОЙ ресторан», включающий публичный сайт, личный кабинет пользователя, интерфейсы бронирования и заказа, экран оформления доставки, бонусный функционал и внутреннюю админ-панель для операционного управления рестораном.</w:t>
+      </w:r>
+    </w:p>
+    <w:p>
+      <w:pPr/>
+      <w:r>
+        <w:rPr>
+          <w:rFonts w:ascii="Times New Roman" w:hAnsi="Times New Roman" w:eastAsia="Times New Roman"/>
+          <w:b w:val="0"/>
+          <w:sz w:val="24"/>
+        </w:rPr>
+        <w:t>1.3. Пользователь — физическое лицо, использующее Сайт/Систему для просмотра меню и акций, регистрации аккаунта, бронирования столов, оформления заказов, отслеживания истории заказов и использования иных пользовательских функций проекта.</w:t>
+      </w:r>
+    </w:p>
+    <w:p>
+      <w:pPr/>
+      <w:r>
+        <w:rPr>
+          <w:rFonts w:ascii="Times New Roman" w:hAnsi="Times New Roman" w:eastAsia="Times New Roman"/>
+          <w:b w:val="0"/>
+          <w:sz w:val="24"/>
+        </w:rPr>
+        <w:t>1.4. Учётная запись (аккаунт) — персональная запись Пользователя в Системе, содержащая уникальный идентификатор, имя, номер телефона, пароль в виде хеша, историю бронирований и заказов, бонусный баланс и подключённые в интерфейсе способы оплаты, если они доступны в текущей версии проекта.</w:t>
+      </w:r>
+    </w:p>
+    <w:p>
+      <w:pPr/>
+      <w:r>
+        <w:rPr>
+          <w:rFonts w:ascii="Times New Roman" w:hAnsi="Times New Roman" w:eastAsia="Times New Roman"/>
+          <w:b w:val="0"/>
+          <w:sz w:val="24"/>
+        </w:rPr>
+        <w:t>1.5. Админ-панель — внутренний интерфейс Системы по адресу `/admin`, предназначенный для обработки заказов, бронирований, доставки, бонусных операций, контента меню и промо-материалов.</w:t>
+      </w:r>
+    </w:p>
+    <w:p>
+      <w:pPr/>
+      <w:r>
+        <w:rPr>
+          <w:rFonts w:ascii="Times New Roman" w:hAnsi="Times New Roman" w:eastAsia="Times New Roman"/>
+          <w:b w:val="0"/>
+          <w:sz w:val="24"/>
+        </w:rPr>
+        <w:t>1.6. Администратор/менеджер — уполномоченный сотрудник ресторана, чья учётная запись допущена к админ-панели. В текущей версии Системы используется единый внутренний уровень служебного доступа без разделения на отдельные иерархические роли и уровни привилегий.</w:t>
+      </w:r>
+    </w:p>
+    <w:p>
+      <w:pPr/>
+      <w:r>
+        <w:rPr>
+          <w:rFonts w:ascii="Times New Roman" w:hAnsi="Times New Roman" w:eastAsia="Times New Roman"/>
+          <w:b w:val="0"/>
+          <w:sz w:val="24"/>
+        </w:rPr>
+        <w:t>1.7. Бронирование — оформленная через Систему запись о резервировании столика на выбранные дату и время.</w:t>
+      </w:r>
+    </w:p>
+    <w:p>
+      <w:pPr/>
+      <w:r>
+        <w:rPr>
+          <w:rFonts w:ascii="Times New Roman" w:hAnsi="Times New Roman" w:eastAsia="Times New Roman"/>
+          <w:b w:val="0"/>
+          <w:sz w:val="24"/>
+        </w:rPr>
+        <w:t>1.8. Заказ — оформленный через Систему заказ блюд в зале ресторана или на доставку.</w:t>
+      </w:r>
+    </w:p>
+    <w:p>
+      <w:pPr/>
+      <w:r>
+        <w:rPr>
+          <w:rFonts w:ascii="Times New Roman" w:hAnsi="Times New Roman" w:eastAsia="Times New Roman"/>
+          <w:b w:val="0"/>
+          <w:sz w:val="24"/>
+        </w:rPr>
+        <w:t>1.9. Демо-способ оплаты — учебный способ оплаты, доступный в интерфейсе проекта исключительно для демонстрации пользовательского сценария без ввода и хранения реальных платёжных реквизитов банковской карты.</w:t>
+      </w:r>
+    </w:p>
+    <w:p>
+      <w:pPr/>
+      <w:r>
+        <w:rPr>
+          <w:rFonts w:ascii="Times New Roman" w:hAnsi="Times New Roman" w:eastAsia="Times New Roman"/>
+          <w:b w:val="0"/>
+          <w:sz w:val="24"/>
+        </w:rPr>
+        <w:t>1.10. Персональные данные — информация, относящаяся к Пользователю прямо или косвенно, включая имя, номер телефона, данные учётной записи, историю бронирований, заказов, бонусных операций и иные сведения, переданные через формы Системы.</w:t>
+      </w:r>
+    </w:p>
+    <w:p>
+      <w:pPr/>
+      <w:r>
+        <w:rPr>
+          <w:rFonts w:ascii="Times New Roman" w:hAnsi="Times New Roman" w:eastAsia="Times New Roman"/>
+          <w:b w:val="0"/>
+          <w:sz w:val="24"/>
+        </w:rPr>
+        <w:t>2. Общие положения</w:t>
+      </w:r>
+    </w:p>
+    <w:p>
+      <w:pPr/>
+      <w:r>
+        <w:rPr>
+          <w:rFonts w:ascii="Times New Roman" w:hAnsi="Times New Roman" w:eastAsia="Times New Roman"/>
+          <w:b w:val="0"/>
+          <w:sz w:val="24"/>
+        </w:rPr>
+        <w:t>2.1. Настоящее Соглашение регулирует использование Сайта/Системы ресторана «СВОЙ ресторан» и применяется ко всем Пользователям, использующим публичные и авторизованные функции проекта.</w:t>
+      </w:r>
+    </w:p>
+    <w:p>
+      <w:pPr/>
+      <w:r>
+        <w:rPr>
+          <w:rFonts w:ascii="Times New Roman" w:hAnsi="Times New Roman" w:eastAsia="Times New Roman"/>
+          <w:b w:val="0"/>
+          <w:sz w:val="24"/>
+        </w:rPr>
+        <w:t>2.2. Регистрация аккаунта, вход в личный кабинет, создание бронирования, оформление заказа либо дальнейшее использование Сайта/Системы означает полное и безоговорочное принятие условий настоящего Соглашения и согласие с применимыми правилами обработки персональных данных.</w:t>
+      </w:r>
+    </w:p>
+    <w:p>
+      <w:pPr/>
+      <w:r>
+        <w:rPr>
+          <w:rFonts w:ascii="Times New Roman" w:hAnsi="Times New Roman" w:eastAsia="Times New Roman"/>
+          <w:b w:val="0"/>
+          <w:sz w:val="24"/>
+        </w:rPr>
+        <w:t>2.3. Компания вправе изменять настоящее Соглашение в любое время. Новая редакция применяется с момента её размещения на сайте, если иное не указано дополнительно.</w:t>
+      </w:r>
+    </w:p>
+    <w:p>
+      <w:pPr/>
+      <w:r>
+        <w:rPr>
+          <w:rFonts w:ascii="Times New Roman" w:hAnsi="Times New Roman" w:eastAsia="Times New Roman"/>
+          <w:b w:val="0"/>
+          <w:sz w:val="24"/>
+        </w:rPr>
+        <w:t>2.4. При обработке персональных данных Компания руководствуется действующим законодательством Российской Федерации, включая Федеральный закон № 152-ФЗ «О персональных данных».</w:t>
+      </w:r>
+    </w:p>
+    <w:p>
+      <w:pPr/>
+      <w:r>
+        <w:rPr>
+          <w:rFonts w:ascii="Times New Roman" w:hAnsi="Times New Roman" w:eastAsia="Times New Roman"/>
+          <w:b w:val="0"/>
+          <w:sz w:val="24"/>
+        </w:rPr>
+        <w:t>3. Доступ к Системе и порядок использования</w:t>
+      </w:r>
+    </w:p>
+    <w:p>
+      <w:pPr/>
+      <w:r>
+        <w:rPr>
+          <w:rFonts w:ascii="Times New Roman" w:hAnsi="Times New Roman" w:eastAsia="Times New Roman"/>
+          <w:b w:val="0"/>
+          <w:sz w:val="24"/>
+        </w:rPr>
+        <w:t>3.1. Без авторизации Пользователь может просматривать публичные разделы Сайта, включая главную страницу, меню, акции, информацию о доставке и иные открытые материалы проекта.</w:t>
+      </w:r>
+    </w:p>
+    <w:p>
+      <w:pPr/>
+      <w:r>
+        <w:rPr>
+          <w:rFonts w:ascii="Times New Roman" w:hAnsi="Times New Roman" w:eastAsia="Times New Roman"/>
+          <w:b w:val="0"/>
+          <w:sz w:val="24"/>
+        </w:rPr>
+        <w:t>3.2. Для доступа к личному кабинету, истории заказов, бонусному балансу, бронированиям и доступным способам оплаты Пользователь создаёт аккаунт с указанием имени, номера телефона и пароля.</w:t>
+      </w:r>
+    </w:p>
+    <w:p>
+      <w:pPr/>
+      <w:r>
+        <w:rPr>
+          <w:rFonts w:ascii="Times New Roman" w:hAnsi="Times New Roman" w:eastAsia="Times New Roman"/>
+          <w:b w:val="0"/>
+          <w:sz w:val="24"/>
+        </w:rPr>
+        <w:t>3.3. Пользователь обязан обеспечивать конфиденциальность своих учётных данных и незамедлительно прекратить использование скомпрометированной учётной записи либо обратиться в ресторан при подозрении на несанкционированный доступ.</w:t>
+      </w:r>
+    </w:p>
+    <w:p>
+      <w:pPr/>
+      <w:r>
+        <w:rPr>
+          <w:rFonts w:ascii="Times New Roman" w:hAnsi="Times New Roman" w:eastAsia="Times New Roman"/>
+          <w:b w:val="0"/>
+          <w:sz w:val="24"/>
+        </w:rPr>
+        <w:t>3.4. Доступ к внутренним функциям управления Системой предоставляется только уполномоченным сотрудникам ресторана через учётные записи администратора/менеджера.</w:t>
+      </w:r>
+    </w:p>
+    <w:p>
+      <w:pPr/>
+      <w:r>
+        <w:rPr>
+          <w:rFonts w:ascii="Times New Roman" w:hAnsi="Times New Roman" w:eastAsia="Times New Roman"/>
+          <w:b w:val="0"/>
+          <w:sz w:val="24"/>
+        </w:rPr>
+        <w:t>3.5. Система не предусматривает самостоятельное распределение внутренних ролей вида «директор», «оператор бронирования», «контент-редактор» или иных уровней привилегий. Все служебные действия в backoffice выполняются через единый тип учётной записи «администратор/менеджер» в пределах задач, определённых Компанией.</w:t>
+      </w:r>
+    </w:p>
+    <w:p>
+      <w:pPr/>
+      <w:r>
+        <w:rPr>
+          <w:rFonts w:ascii="Times New Roman" w:hAnsi="Times New Roman" w:eastAsia="Times New Roman"/>
+          <w:b w:val="0"/>
+          <w:sz w:val="24"/>
+        </w:rPr>
+        <w:t>3.6. Администратор/менеджер вправе обрабатывать бронирования, заказы и доставку, корректировать бонусный баланс, управлять содержимым меню и промо-разделов, а также выполнять иные операционные действия, прямо поддерживаемые интерфейсом админ-панели.</w:t>
+      </w:r>
+    </w:p>
+    <w:p>
+      <w:pPr/>
+      <w:r>
+        <w:rPr>
+          <w:rFonts w:ascii="Times New Roman" w:hAnsi="Times New Roman" w:eastAsia="Times New Roman"/>
+          <w:b w:val="0"/>
+          <w:sz w:val="24"/>
+        </w:rPr>
+        <w:t>4. Обработка данных и платёжные сценарии</w:t>
+      </w:r>
+    </w:p>
+    <w:p>
+      <w:pPr/>
+      <w:r>
+        <w:rPr>
+          <w:rFonts w:ascii="Times New Roman" w:hAnsi="Times New Roman" w:eastAsia="Times New Roman"/>
+          <w:b w:val="0"/>
+          <w:sz w:val="24"/>
+        </w:rPr>
+        <w:t>4.1. Компания может обрабатывать следующие сведения о Пользователе: имя, номер телефона, пароль в виде хеша, историю бронирований, историю заказов, бонусный баланс, технические отметки, связанные с использованием Системы, и иные данные, явно введённые Пользователем в формах Сайта.</w:t>
+      </w:r>
+    </w:p>
+    <w:p>
+      <w:pPr/>
+      <w:r>
+        <w:rPr>
+          <w:rFonts w:ascii="Times New Roman" w:hAnsi="Times New Roman" w:eastAsia="Times New Roman"/>
+          <w:b w:val="0"/>
+          <w:sz w:val="24"/>
+        </w:rPr>
+        <w:t>4.2. Пароли Пользователей не хранятся в открытом виде и сохраняются в виде криптографического хеша.</w:t>
+      </w:r>
+    </w:p>
+    <w:p>
+      <w:pPr/>
+      <w:r>
+        <w:rPr>
+          <w:rFonts w:ascii="Times New Roman" w:hAnsi="Times New Roman" w:eastAsia="Times New Roman"/>
+          <w:b w:val="0"/>
+          <w:sz w:val="24"/>
+        </w:rPr>
+        <w:t>4.3. Пользователь обязуется предоставлять достоверные данные. Компания не несёт ответственности за последствия, вызванные предоставлением неполной или недостоверной информации, включая невозможность подтвердить бронирование, заказ или обратную связь с Пользователем.</w:t>
+      </w:r>
+    </w:p>
+    <w:p>
+      <w:pPr/>
+      <w:r>
+        <w:rPr>
+          <w:rFonts w:ascii="Times New Roman" w:hAnsi="Times New Roman" w:eastAsia="Times New Roman"/>
+          <w:b w:val="0"/>
+          <w:sz w:val="24"/>
+        </w:rPr>
+        <w:t>4.4. Текущая версия проекта использует учебный демо-режим оплаты. Сайт не предназначен для приёма, обработки или хранения реальных номеров банковских карт, CVV/CVC-кодов и иных полных платёжных реквизитов.</w:t>
+      </w:r>
+    </w:p>
+    <w:p>
+      <w:pPr/>
+      <w:r>
+        <w:rPr>
+          <w:rFonts w:ascii="Times New Roman" w:hAnsi="Times New Roman" w:eastAsia="Times New Roman"/>
+          <w:b w:val="0"/>
+          <w:sz w:val="24"/>
+        </w:rPr>
+        <w:t>4.5. В личном кабинете Пользователю могут быть доступны только демо-способы оплаты, заранее определённые интерфейсом проекта. Для работы такого сценария Система может хранить обозначение выбранного демо-способа оплаты, его бренд, маскированные последние четыре символа и служебные временные метки, необходимые для отображения в интерфейсе и истории операций.</w:t>
+      </w:r>
+    </w:p>
+    <w:p>
+      <w:pPr/>
+      <w:r>
+        <w:rPr>
+          <w:rFonts w:ascii="Times New Roman" w:hAnsi="Times New Roman" w:eastAsia="Times New Roman"/>
+          <w:b w:val="0"/>
+          <w:sz w:val="24"/>
+        </w:rPr>
+        <w:t>4.6. Согласие на обработку сведений о выбранном демо-способе оплаты включено в настоящее Соглашение. Пользователь может отключить подключённый демо-способ оплаты через интерфейс профиля, если такая функция доступна в текущей версии проекта.</w:t>
+      </w:r>
+    </w:p>
+    <w:p>
+      <w:pPr/>
+      <w:r>
+        <w:rPr>
+          <w:rFonts w:ascii="Times New Roman" w:hAnsi="Times New Roman" w:eastAsia="Times New Roman"/>
+          <w:b w:val="0"/>
+          <w:sz w:val="24"/>
+        </w:rPr>
+        <w:t>4.7. Текущая учебная версия проекта не является сертифицированной системой обработки платёжных карт и не заявляет о соответствии требованиям PCI DSS. Если в будущем будет подключён внешний платёжный провайдер, условия обработки платёжных данных могут быть дополнительно изменены и опубликованы отдельно.</w:t>
+      </w:r>
+    </w:p>
+    <w:p>
+      <w:pPr/>
+      <w:r>
+        <w:rPr>
+          <w:rFonts w:ascii="Times New Roman" w:hAnsi="Times New Roman" w:eastAsia="Times New Roman"/>
+          <w:b w:val="0"/>
+          <w:sz w:val="24"/>
+        </w:rPr>
+        <w:t>5. Обязанности и ответственность сторон</w:t>
+      </w:r>
+    </w:p>
+    <w:p>
+      <w:pPr/>
+      <w:r>
+        <w:rPr>
+          <w:rFonts w:ascii="Times New Roman" w:hAnsi="Times New Roman" w:eastAsia="Times New Roman"/>
+          <w:b w:val="0"/>
+          <w:sz w:val="24"/>
+        </w:rPr>
+        <w:t>5.1. Компания обязуется прилагать разумные усилия для поддержания работоспособности Сайта/Системы и защиты данных от несанкционированного доступа с учётом характера и стадии развития проекта.</w:t>
+      </w:r>
+    </w:p>
+    <w:p>
+      <w:pPr/>
+      <w:r>
+        <w:rPr>
+          <w:rFonts w:ascii="Times New Roman" w:hAnsi="Times New Roman" w:eastAsia="Times New Roman"/>
+          <w:b w:val="0"/>
+          <w:sz w:val="24"/>
+        </w:rPr>
+        <w:t>5.2. Пользователь обязуется не предпринимать попыток несанкционированного доступа к чужим аккаунтам и данным, не вмешиваться в работу Сайта/Системы, не использовать Систему для распространения вредоносного программного обеспечения и не совершать действий, нарушающих применимое законодательство.</w:t>
+      </w:r>
+    </w:p>
+    <w:p>
+      <w:pPr/>
+      <w:r>
+        <w:rPr>
+          <w:rFonts w:ascii="Times New Roman" w:hAnsi="Times New Roman" w:eastAsia="Times New Roman"/>
+          <w:b w:val="0"/>
+          <w:sz w:val="24"/>
+        </w:rPr>
+        <w:t>5.3. Администратор/менеджер обязан использовать служебный доступ исключительно в рабочих целях, не передавать учётные данные третьим лицам и соблюдать конфиденциальность информации, доступной через админ-панель.</w:t>
+      </w:r>
+    </w:p>
+    <w:p>
+      <w:pPr/>
+      <w:r>
+        <w:rPr>
+          <w:rFonts w:ascii="Times New Roman" w:hAnsi="Times New Roman" w:eastAsia="Times New Roman"/>
+          <w:b w:val="0"/>
+          <w:sz w:val="24"/>
+        </w:rPr>
+        <w:t>5.4. Компания не несёт ответственности за перебои в работе Сайта/Системы, вызванные действиями третьих лиц, техническими сбоями, профилактическими работами, проблемами связи, инфраструктуры либо обстоятельствами непреодолимой силы.</w:t>
+      </w:r>
+    </w:p>
+    <w:p>
+      <w:pPr/>
+      <w:r>
+        <w:rPr>
+          <w:rFonts w:ascii="Times New Roman" w:hAnsi="Times New Roman" w:eastAsia="Times New Roman"/>
+          <w:b w:val="0"/>
+          <w:sz w:val="24"/>
+        </w:rPr>
+        <w:t>6. Заключительные положения</w:t>
+      </w:r>
+    </w:p>
+    <w:p>
+      <w:pPr/>
+      <w:r>
+        <w:rPr>
+          <w:rFonts w:ascii="Times New Roman" w:hAnsi="Times New Roman" w:eastAsia="Times New Roman"/>
+          <w:b w:val="0"/>
+          <w:sz w:val="24"/>
+        </w:rPr>
+        <w:t>6.1. Настоящее Соглашение вступает в силу для Пользователя с момента первого использования Сайта/Системы, а для администратора/менеджера — с момента предоставления служебного доступа к админ-панели.</w:t>
+      </w:r>
+    </w:p>
+    <w:p>
+      <w:pPr/>
+      <w:r>
+        <w:rPr>
+          <w:rFonts w:ascii="Times New Roman" w:hAnsi="Times New Roman" w:eastAsia="Times New Roman"/>
+          <w:b w:val="0"/>
+          <w:sz w:val="24"/>
+        </w:rPr>
+        <w:t>6.2. Все споры и разногласия подлежат урегулированию путём переговоров, а при недостижении согласия — в судебном порядке по месту нахождения ресторана в соответствии с законодательством Российской Федерации.</w:t>
+      </w:r>
+    </w:p>
+    <w:p>
+      <w:pPr/>
+      <w:r>
+        <w:rPr>
+          <w:rFonts w:ascii="Times New Roman" w:hAnsi="Times New Roman" w:eastAsia="Times New Roman"/>
+          <w:b w:val="0"/>
+          <w:sz w:val="24"/>
+        </w:rPr>
+        <w:t>6.3. По вопросам использования Сайта/Системы Пользователь может обращаться в ресторан по телефону +7 (670) 690-42-42 или по электронной почте six-seven@yandex.ru.</w:t>
       </w:r>
     </w:p>
     <w:sectPr>

</xml_diff>